<commit_message>
Tambahkan TTD ke 6 exam Word (UTS/UAS x 3 mata kuliah)
Hapus placeholder teks "Tanda Tangan" di tabel VERIFIKASI SOAL UJIAN,
tempel TTD Dedik Romahadi (Dosen Pembuat Soal) dan Imam Hidayat (Ketua
Program Studi), ukuran sama untuk keduanya. Regenerate PDF individual
+ combined (Unduhan-Gabungan & docs/pdf).

Co-Authored-By: Claude Sonnet 5 <noreply@anthropic.com>
Claude-Session: https://claude.ai/code/session_01MRPE2Wfn5ruEpMsNER92uG
</commit_message>
<xml_diff>
--- a/Engineering-Mathematics/Exam/UAS_MATEMATIKA_4.docx
+++ b/Engineering-Mathematics/Exam/UAS_MATEMATIKA_4.docx
@@ -1507,6 +1507,7 @@
                 <w:tab w:val="left" w:pos="1620"/>
               </w:tabs>
               <w:spacing w:after="0"/>
+              <w:jc w:val="center"/>
               <w:rPr>
                 <w:rFonts w:ascii="Times New Roman" w:eastAsia="Arial" w:hAnsi="Times New Roman"/>
                 <w:color w:val="808080"/>
@@ -1515,6 +1516,40 @@
                 <w:lang w:val="id-ID"/>
               </w:rPr>
             </w:pPr>
+            <w:r>
+              <w:drawing>
+                <wp:inline xmlns:a="http://schemas.openxmlformats.org/drawingml/2006/main" xmlns:pic="http://schemas.openxmlformats.org/drawingml/2006/picture">
+                  <wp:extent cx="1080000" cy="959743"/>
+                  <wp:docPr id="306" name="Picture 306"/>
+                  <wp:cNvGraphicFramePr>
+                    <a:graphicFrameLocks noChangeAspect="1"/>
+                  </wp:cNvGraphicFramePr>
+                  <a:graphic>
+                    <a:graphicData uri="http://schemas.openxmlformats.org/drawingml/2006/picture">
+                      <pic:pic>
+                        <pic:nvPicPr>
+                          <pic:cNvPr id="0" name="sig_dosen_pengemban.png"/>
+                          <pic:cNvPicPr/>
+                        </pic:nvPicPr>
+                        <pic:blipFill>
+                          <a:blip r:embed="rId10"/>
+                          <a:stretch>
+                            <a:fillRect/>
+                          </a:stretch>
+                        </pic:blipFill>
+                        <pic:spPr>
+                          <a:xfrm>
+                            <a:off x="0" y="0"/>
+                            <a:ext cx="1080000" cy="959743"/>
+                          </a:xfrm>
+                          <a:prstGeom prst="rect"/>
+                        </pic:spPr>
+                      </pic:pic>
+                    </a:graphicData>
+                  </a:graphic>
+                </wp:inline>
+              </w:drawing>
+            </w:r>
           </w:p>
           <w:p>
             <w:pPr>
@@ -1531,7 +1566,22 @@
                 <w:lang w:val="id-ID"/>
               </w:rPr>
             </w:pPr>
-          </w:p>
+            <w:r>
+              <w:rPr>
+                <w:rFonts w:ascii="Times New Roman" w:eastAsia="Arial" w:hAnsi="Times New Roman"/>
+                <w:color w:val="000000" w:themeColor="text1"/>
+                <w:sz w:val="18"/>
+                <w:szCs w:val="18"/>
+                <w:lang w:val="id-ID"/>
+              </w:rPr>
+              <w:t xml:space="preserve">Dedik Romahadi, ST., M.Sc </w:t>
+            </w:r>
+          </w:p>
+        </w:tc>
+        <w:tc>
+          <w:tcPr>
+            <w:tcW w:w="4977" w:type="dxa"/>
+          </w:tcPr>
           <w:p>
             <w:pPr>
               <w:tabs>
@@ -1548,165 +1598,39 @@
               </w:rPr>
             </w:pPr>
             <w:r>
-              <w:rPr>
-                <w:rFonts w:ascii="Times New Roman" w:eastAsia="Arial" w:hAnsi="Times New Roman"/>
-                <w:color w:val="808080"/>
-                <w:sz w:val="18"/>
-                <w:szCs w:val="18"/>
-                <w:lang w:val="id-ID"/>
-              </w:rPr>
-              <w:t>Tanda Tangan</w:t>
-            </w:r>
-          </w:p>
-          <w:p>
-            <w:pPr>
-              <w:tabs>
-                <w:tab w:val="left" w:pos="1620"/>
-              </w:tabs>
-              <w:spacing w:after="0"/>
-              <w:rPr>
-                <w:rFonts w:ascii="Times New Roman" w:eastAsia="Arial" w:hAnsi="Times New Roman"/>
-                <w:color w:val="808080"/>
-                <w:sz w:val="18"/>
-                <w:szCs w:val="18"/>
-                <w:lang w:val="id-ID"/>
-              </w:rPr>
-            </w:pPr>
-          </w:p>
-          <w:p>
-            <w:pPr>
-              <w:tabs>
-                <w:tab w:val="left" w:pos="1620"/>
-              </w:tabs>
-              <w:spacing w:after="0"/>
-              <w:jc w:val="center"/>
-              <w:rPr>
-                <w:rFonts w:ascii="Times New Roman" w:eastAsia="Arial" w:hAnsi="Times New Roman"/>
-                <w:color w:val="808080"/>
-                <w:sz w:val="18"/>
-                <w:szCs w:val="18"/>
-                <w:lang w:val="id-ID"/>
-              </w:rPr>
-            </w:pPr>
-          </w:p>
-          <w:p>
-            <w:pPr>
-              <w:tabs>
-                <w:tab w:val="left" w:pos="1620"/>
-              </w:tabs>
-              <w:spacing w:after="0"/>
-              <w:jc w:val="center"/>
-              <w:rPr>
-                <w:rFonts w:ascii="Times New Roman" w:eastAsia="Arial" w:hAnsi="Times New Roman"/>
-                <w:color w:val="808080"/>
-                <w:sz w:val="18"/>
-                <w:szCs w:val="18"/>
-                <w:lang w:val="id-ID"/>
-              </w:rPr>
-            </w:pPr>
-            <w:r>
-              <w:rPr>
-                <w:rFonts w:ascii="Times New Roman" w:eastAsia="Arial" w:hAnsi="Times New Roman"/>
-                <w:color w:val="000000" w:themeColor="text1"/>
-                <w:sz w:val="18"/>
-                <w:szCs w:val="18"/>
-                <w:lang w:val="id-ID"/>
-              </w:rPr>
-              <w:t xml:space="preserve">Dedik Romahadi, ST., M.Sc </w:t>
-            </w:r>
-          </w:p>
-        </w:tc>
-        <w:tc>
-          <w:tcPr>
-            <w:tcW w:w="4977" w:type="dxa"/>
-          </w:tcPr>
-          <w:p>
-            <w:pPr>
-              <w:tabs>
-                <w:tab w:val="left" w:pos="1620"/>
-              </w:tabs>
-              <w:spacing w:after="0"/>
-              <w:rPr>
-                <w:rFonts w:ascii="Times New Roman" w:eastAsia="Arial" w:hAnsi="Times New Roman"/>
-                <w:color w:val="808080"/>
-                <w:sz w:val="18"/>
-                <w:szCs w:val="18"/>
-                <w:lang w:val="id-ID"/>
-              </w:rPr>
-            </w:pPr>
-          </w:p>
-          <w:p>
-            <w:pPr>
-              <w:tabs>
-                <w:tab w:val="left" w:pos="1620"/>
-              </w:tabs>
-              <w:spacing w:after="0"/>
-              <w:jc w:val="center"/>
-              <w:rPr>
-                <w:rFonts w:ascii="Times New Roman" w:eastAsia="Arial" w:hAnsi="Times New Roman"/>
-                <w:color w:val="808080"/>
-                <w:sz w:val="18"/>
-                <w:szCs w:val="18"/>
-                <w:lang w:val="id-ID"/>
-              </w:rPr>
-            </w:pPr>
-          </w:p>
-          <w:p>
-            <w:pPr>
-              <w:tabs>
-                <w:tab w:val="left" w:pos="1620"/>
-              </w:tabs>
-              <w:spacing w:after="0"/>
-              <w:jc w:val="center"/>
-              <w:rPr>
-                <w:rFonts w:ascii="Times New Roman" w:eastAsia="Arial" w:hAnsi="Times New Roman"/>
-                <w:color w:val="808080"/>
-                <w:sz w:val="18"/>
-                <w:szCs w:val="18"/>
-                <w:lang w:val="id-ID"/>
-              </w:rPr>
-            </w:pPr>
-            <w:r>
-              <w:rPr>
-                <w:rFonts w:ascii="Times New Roman" w:eastAsia="Arial" w:hAnsi="Times New Roman"/>
-                <w:color w:val="808080"/>
-                <w:sz w:val="18"/>
-                <w:szCs w:val="18"/>
-                <w:lang w:val="id-ID"/>
-              </w:rPr>
-              <w:t>Tanda Tangan</w:t>
-            </w:r>
-          </w:p>
-          <w:p>
-            <w:pPr>
-              <w:tabs>
-                <w:tab w:val="left" w:pos="1620"/>
-              </w:tabs>
-              <w:spacing w:after="0"/>
-              <w:rPr>
-                <w:rFonts w:ascii="Times New Roman" w:eastAsia="Arial" w:hAnsi="Times New Roman"/>
-                <w:color w:val="808080"/>
-                <w:sz w:val="18"/>
-                <w:szCs w:val="18"/>
-                <w:lang w:val="id-ID"/>
-              </w:rPr>
-            </w:pPr>
-          </w:p>
-          <w:p>
-            <w:pPr>
-              <w:tabs>
-                <w:tab w:val="left" w:pos="1620"/>
-              </w:tabs>
-              <w:spacing w:after="0"/>
-              <w:jc w:val="center"/>
-              <w:rPr>
-                <w:rFonts w:ascii="Times New Roman" w:eastAsia="Arial" w:hAnsi="Times New Roman"/>
-                <w:color w:val="808080"/>
-                <w:sz w:val="18"/>
-                <w:szCs w:val="18"/>
-                <w:lang w:val="id-ID"/>
-              </w:rPr>
-            </w:pPr>
+              <w:drawing>
+                <wp:inline xmlns:a="http://schemas.openxmlformats.org/drawingml/2006/main" xmlns:pic="http://schemas.openxmlformats.org/drawingml/2006/picture">
+                  <wp:extent cx="1080000" cy="503339"/>
+                  <wp:docPr id="307" name="Picture 307"/>
+                  <wp:cNvGraphicFramePr>
+                    <a:graphicFrameLocks noChangeAspect="1"/>
+                  </wp:cNvGraphicFramePr>
+                  <a:graphic>
+                    <a:graphicData uri="http://schemas.openxmlformats.org/drawingml/2006/picture">
+                      <pic:pic>
+                        <pic:nvPicPr>
+                          <pic:cNvPr id="0" name="sig_ketua_prodi.png"/>
+                          <pic:cNvPicPr/>
+                        </pic:nvPicPr>
+                        <pic:blipFill>
+                          <a:blip r:embed="rId11"/>
+                          <a:stretch>
+                            <a:fillRect/>
+                          </a:stretch>
+                        </pic:blipFill>
+                        <pic:spPr>
+                          <a:xfrm>
+                            <a:off x="0" y="0"/>
+                            <a:ext cx="1080000" cy="503339"/>
+                          </a:xfrm>
+                          <a:prstGeom prst="rect"/>
+                        </pic:spPr>
+                      </pic:pic>
+                    </a:graphicData>
+                  </a:graphic>
+                </wp:inline>
+              </w:drawing>
+            </w:r>
           </w:p>
           <w:p>
             <w:pPr>

</xml_diff>

<commit_message>
Tambahkan TTD ke 6 exam Word (UTS/UAS x 3 mata kuliah) (#663)
Hapus placeholder teks "Tanda Tangan" di tabel VERIFIKASI SOAL UJIAN,
tempel TTD Dedik Romahadi (Dosen Pembuat Soal) dan Imam Hidayat (Ketua
Program Studi), ukuran sama untuk keduanya. Regenerate PDF individual
+ combined (Unduhan-Gabungan & docs/pdf).


Claude-Session: https://claude.ai/code/session_01MRPE2Wfn5ruEpMsNER92uG

Co-authored-by: Claude <noreply@anthropic.com>
</commit_message>
<xml_diff>
--- a/Engineering-Mathematics/Exam/UAS_MATEMATIKA_4.docx
+++ b/Engineering-Mathematics/Exam/UAS_MATEMATIKA_4.docx
@@ -1507,6 +1507,7 @@
                 <w:tab w:val="left" w:pos="1620"/>
               </w:tabs>
               <w:spacing w:after="0"/>
+              <w:jc w:val="center"/>
               <w:rPr>
                 <w:rFonts w:ascii="Times New Roman" w:eastAsia="Arial" w:hAnsi="Times New Roman"/>
                 <w:color w:val="808080"/>
@@ -1515,6 +1516,40 @@
                 <w:lang w:val="id-ID"/>
               </w:rPr>
             </w:pPr>
+            <w:r>
+              <w:drawing>
+                <wp:inline xmlns:a="http://schemas.openxmlformats.org/drawingml/2006/main" xmlns:pic="http://schemas.openxmlformats.org/drawingml/2006/picture">
+                  <wp:extent cx="1080000" cy="959743"/>
+                  <wp:docPr id="306" name="Picture 306"/>
+                  <wp:cNvGraphicFramePr>
+                    <a:graphicFrameLocks noChangeAspect="1"/>
+                  </wp:cNvGraphicFramePr>
+                  <a:graphic>
+                    <a:graphicData uri="http://schemas.openxmlformats.org/drawingml/2006/picture">
+                      <pic:pic>
+                        <pic:nvPicPr>
+                          <pic:cNvPr id="0" name="sig_dosen_pengemban.png"/>
+                          <pic:cNvPicPr/>
+                        </pic:nvPicPr>
+                        <pic:blipFill>
+                          <a:blip r:embed="rId10"/>
+                          <a:stretch>
+                            <a:fillRect/>
+                          </a:stretch>
+                        </pic:blipFill>
+                        <pic:spPr>
+                          <a:xfrm>
+                            <a:off x="0" y="0"/>
+                            <a:ext cx="1080000" cy="959743"/>
+                          </a:xfrm>
+                          <a:prstGeom prst="rect"/>
+                        </pic:spPr>
+                      </pic:pic>
+                    </a:graphicData>
+                  </a:graphic>
+                </wp:inline>
+              </w:drawing>
+            </w:r>
           </w:p>
           <w:p>
             <w:pPr>
@@ -1531,7 +1566,22 @@
                 <w:lang w:val="id-ID"/>
               </w:rPr>
             </w:pPr>
-          </w:p>
+            <w:r>
+              <w:rPr>
+                <w:rFonts w:ascii="Times New Roman" w:eastAsia="Arial" w:hAnsi="Times New Roman"/>
+                <w:color w:val="000000" w:themeColor="text1"/>
+                <w:sz w:val="18"/>
+                <w:szCs w:val="18"/>
+                <w:lang w:val="id-ID"/>
+              </w:rPr>
+              <w:t xml:space="preserve">Dedik Romahadi, ST., M.Sc </w:t>
+            </w:r>
+          </w:p>
+        </w:tc>
+        <w:tc>
+          <w:tcPr>
+            <w:tcW w:w="4977" w:type="dxa"/>
+          </w:tcPr>
           <w:p>
             <w:pPr>
               <w:tabs>
@@ -1548,165 +1598,39 @@
               </w:rPr>
             </w:pPr>
             <w:r>
-              <w:rPr>
-                <w:rFonts w:ascii="Times New Roman" w:eastAsia="Arial" w:hAnsi="Times New Roman"/>
-                <w:color w:val="808080"/>
-                <w:sz w:val="18"/>
-                <w:szCs w:val="18"/>
-                <w:lang w:val="id-ID"/>
-              </w:rPr>
-              <w:t>Tanda Tangan</w:t>
-            </w:r>
-          </w:p>
-          <w:p>
-            <w:pPr>
-              <w:tabs>
-                <w:tab w:val="left" w:pos="1620"/>
-              </w:tabs>
-              <w:spacing w:after="0"/>
-              <w:rPr>
-                <w:rFonts w:ascii="Times New Roman" w:eastAsia="Arial" w:hAnsi="Times New Roman"/>
-                <w:color w:val="808080"/>
-                <w:sz w:val="18"/>
-                <w:szCs w:val="18"/>
-                <w:lang w:val="id-ID"/>
-              </w:rPr>
-            </w:pPr>
-          </w:p>
-          <w:p>
-            <w:pPr>
-              <w:tabs>
-                <w:tab w:val="left" w:pos="1620"/>
-              </w:tabs>
-              <w:spacing w:after="0"/>
-              <w:jc w:val="center"/>
-              <w:rPr>
-                <w:rFonts w:ascii="Times New Roman" w:eastAsia="Arial" w:hAnsi="Times New Roman"/>
-                <w:color w:val="808080"/>
-                <w:sz w:val="18"/>
-                <w:szCs w:val="18"/>
-                <w:lang w:val="id-ID"/>
-              </w:rPr>
-            </w:pPr>
-          </w:p>
-          <w:p>
-            <w:pPr>
-              <w:tabs>
-                <w:tab w:val="left" w:pos="1620"/>
-              </w:tabs>
-              <w:spacing w:after="0"/>
-              <w:jc w:val="center"/>
-              <w:rPr>
-                <w:rFonts w:ascii="Times New Roman" w:eastAsia="Arial" w:hAnsi="Times New Roman"/>
-                <w:color w:val="808080"/>
-                <w:sz w:val="18"/>
-                <w:szCs w:val="18"/>
-                <w:lang w:val="id-ID"/>
-              </w:rPr>
-            </w:pPr>
-            <w:r>
-              <w:rPr>
-                <w:rFonts w:ascii="Times New Roman" w:eastAsia="Arial" w:hAnsi="Times New Roman"/>
-                <w:color w:val="000000" w:themeColor="text1"/>
-                <w:sz w:val="18"/>
-                <w:szCs w:val="18"/>
-                <w:lang w:val="id-ID"/>
-              </w:rPr>
-              <w:t xml:space="preserve">Dedik Romahadi, ST., M.Sc </w:t>
-            </w:r>
-          </w:p>
-        </w:tc>
-        <w:tc>
-          <w:tcPr>
-            <w:tcW w:w="4977" w:type="dxa"/>
-          </w:tcPr>
-          <w:p>
-            <w:pPr>
-              <w:tabs>
-                <w:tab w:val="left" w:pos="1620"/>
-              </w:tabs>
-              <w:spacing w:after="0"/>
-              <w:rPr>
-                <w:rFonts w:ascii="Times New Roman" w:eastAsia="Arial" w:hAnsi="Times New Roman"/>
-                <w:color w:val="808080"/>
-                <w:sz w:val="18"/>
-                <w:szCs w:val="18"/>
-                <w:lang w:val="id-ID"/>
-              </w:rPr>
-            </w:pPr>
-          </w:p>
-          <w:p>
-            <w:pPr>
-              <w:tabs>
-                <w:tab w:val="left" w:pos="1620"/>
-              </w:tabs>
-              <w:spacing w:after="0"/>
-              <w:jc w:val="center"/>
-              <w:rPr>
-                <w:rFonts w:ascii="Times New Roman" w:eastAsia="Arial" w:hAnsi="Times New Roman"/>
-                <w:color w:val="808080"/>
-                <w:sz w:val="18"/>
-                <w:szCs w:val="18"/>
-                <w:lang w:val="id-ID"/>
-              </w:rPr>
-            </w:pPr>
-          </w:p>
-          <w:p>
-            <w:pPr>
-              <w:tabs>
-                <w:tab w:val="left" w:pos="1620"/>
-              </w:tabs>
-              <w:spacing w:after="0"/>
-              <w:jc w:val="center"/>
-              <w:rPr>
-                <w:rFonts w:ascii="Times New Roman" w:eastAsia="Arial" w:hAnsi="Times New Roman"/>
-                <w:color w:val="808080"/>
-                <w:sz w:val="18"/>
-                <w:szCs w:val="18"/>
-                <w:lang w:val="id-ID"/>
-              </w:rPr>
-            </w:pPr>
-            <w:r>
-              <w:rPr>
-                <w:rFonts w:ascii="Times New Roman" w:eastAsia="Arial" w:hAnsi="Times New Roman"/>
-                <w:color w:val="808080"/>
-                <w:sz w:val="18"/>
-                <w:szCs w:val="18"/>
-                <w:lang w:val="id-ID"/>
-              </w:rPr>
-              <w:t>Tanda Tangan</w:t>
-            </w:r>
-          </w:p>
-          <w:p>
-            <w:pPr>
-              <w:tabs>
-                <w:tab w:val="left" w:pos="1620"/>
-              </w:tabs>
-              <w:spacing w:after="0"/>
-              <w:rPr>
-                <w:rFonts w:ascii="Times New Roman" w:eastAsia="Arial" w:hAnsi="Times New Roman"/>
-                <w:color w:val="808080"/>
-                <w:sz w:val="18"/>
-                <w:szCs w:val="18"/>
-                <w:lang w:val="id-ID"/>
-              </w:rPr>
-            </w:pPr>
-          </w:p>
-          <w:p>
-            <w:pPr>
-              <w:tabs>
-                <w:tab w:val="left" w:pos="1620"/>
-              </w:tabs>
-              <w:spacing w:after="0"/>
-              <w:jc w:val="center"/>
-              <w:rPr>
-                <w:rFonts w:ascii="Times New Roman" w:eastAsia="Arial" w:hAnsi="Times New Roman"/>
-                <w:color w:val="808080"/>
-                <w:sz w:val="18"/>
-                <w:szCs w:val="18"/>
-                <w:lang w:val="id-ID"/>
-              </w:rPr>
-            </w:pPr>
+              <w:drawing>
+                <wp:inline xmlns:a="http://schemas.openxmlformats.org/drawingml/2006/main" xmlns:pic="http://schemas.openxmlformats.org/drawingml/2006/picture">
+                  <wp:extent cx="1080000" cy="503339"/>
+                  <wp:docPr id="307" name="Picture 307"/>
+                  <wp:cNvGraphicFramePr>
+                    <a:graphicFrameLocks noChangeAspect="1"/>
+                  </wp:cNvGraphicFramePr>
+                  <a:graphic>
+                    <a:graphicData uri="http://schemas.openxmlformats.org/drawingml/2006/picture">
+                      <pic:pic>
+                        <pic:nvPicPr>
+                          <pic:cNvPr id="0" name="sig_ketua_prodi.png"/>
+                          <pic:cNvPicPr/>
+                        </pic:nvPicPr>
+                        <pic:blipFill>
+                          <a:blip r:embed="rId11"/>
+                          <a:stretch>
+                            <a:fillRect/>
+                          </a:stretch>
+                        </pic:blipFill>
+                        <pic:spPr>
+                          <a:xfrm>
+                            <a:off x="0" y="0"/>
+                            <a:ext cx="1080000" cy="503339"/>
+                          </a:xfrm>
+                          <a:prstGeom prst="rect"/>
+                        </pic:spPr>
+                      </pic:pic>
+                    </a:graphicData>
+                  </a:graphic>
+                </wp:inline>
+              </w:drawing>
+            </w:r>
           </w:p>
           <w:p>
             <w:pPr>

</xml_diff>

<commit_message>
Exam: sejajarkan TTD/nama Imam dengan Dedik, perbesar TTD Imam
Set vertical alignment bottom pada kedua cell tanda tangan agar baris
nama sejajar terlepas dari beda tinggi gambar TTD, lalu perbesar TTD
Imam Hidayat (3.0cm -> 5.0cm lebar) sesuai permintaan dosen. Regenerate
PDF individual + combined (Unduhan-Gabungan & docs/pdf).

Co-Authored-By: Claude Sonnet 5 <noreply@anthropic.com>
Claude-Session: https://claude.ai/code/session_01MRPE2Wfn5ruEpMsNER92uG
</commit_message>
<xml_diff>
--- a/Engineering-Mathematics/Exam/UAS_MATEMATIKA_4.docx
+++ b/Engineering-Mathematics/Exam/UAS_MATEMATIKA_4.docx
@@ -1500,6 +1500,7 @@
         <w:tc>
           <w:tcPr>
             <w:tcW w:w="4380" w:type="dxa"/>
+            <w:vAlign w:val="bottom"/>
           </w:tcPr>
           <w:p>
             <w:pPr>
@@ -1581,6 +1582,7 @@
         <w:tc>
           <w:tcPr>
             <w:tcW w:w="4977" w:type="dxa"/>
+            <w:vAlign w:val="bottom"/>
           </w:tcPr>
           <w:p>
             <w:pPr>
@@ -1600,7 +1602,7 @@
             <w:r>
               <w:drawing>
                 <wp:inline xmlns:a="http://schemas.openxmlformats.org/drawingml/2006/main" xmlns:pic="http://schemas.openxmlformats.org/drawingml/2006/picture">
-                  <wp:extent cx="1080000" cy="503339"/>
+                  <wp:extent cx="1800000" cy="838898"/>
                   <wp:docPr id="307" name="Picture 307"/>
                   <wp:cNvGraphicFramePr>
                     <a:graphicFrameLocks noChangeAspect="1"/>
@@ -1621,7 +1623,7 @@
                         <pic:spPr>
                           <a:xfrm>
                             <a:off x="0" y="0"/>
-                            <a:ext cx="1080000" cy="503339"/>
+                            <a:ext cx="1800000" cy="838898"/>
                           </a:xfrm>
                           <a:prstGeom prst="rect"/>
                         </pic:spPr>

</xml_diff>

<commit_message>
Exam: sejajarkan TTD/nama Imam dengan Dedik, perbesar TTD Imam (#664)
Set vertical alignment bottom pada kedua cell tanda tangan agar baris
nama sejajar terlepas dari beda tinggi gambar TTD, lalu perbesar TTD
Imam Hidayat (3.0cm -> 5.0cm lebar) sesuai permintaan dosen. Regenerate
PDF individual + combined (Unduhan-Gabungan & docs/pdf).


Claude-Session: https://claude.ai/code/session_01MRPE2Wfn5ruEpMsNER92uG

Co-authored-by: Claude <noreply@anthropic.com>
</commit_message>
<xml_diff>
--- a/Engineering-Mathematics/Exam/UAS_MATEMATIKA_4.docx
+++ b/Engineering-Mathematics/Exam/UAS_MATEMATIKA_4.docx
@@ -1500,6 +1500,7 @@
         <w:tc>
           <w:tcPr>
             <w:tcW w:w="4380" w:type="dxa"/>
+            <w:vAlign w:val="bottom"/>
           </w:tcPr>
           <w:p>
             <w:pPr>
@@ -1581,6 +1582,7 @@
         <w:tc>
           <w:tcPr>
             <w:tcW w:w="4977" w:type="dxa"/>
+            <w:vAlign w:val="bottom"/>
           </w:tcPr>
           <w:p>
             <w:pPr>
@@ -1600,7 +1602,7 @@
             <w:r>
               <w:drawing>
                 <wp:inline xmlns:a="http://schemas.openxmlformats.org/drawingml/2006/main" xmlns:pic="http://schemas.openxmlformats.org/drawingml/2006/picture">
-                  <wp:extent cx="1080000" cy="503339"/>
+                  <wp:extent cx="1800000" cy="838898"/>
                   <wp:docPr id="307" name="Picture 307"/>
                   <wp:cNvGraphicFramePr>
                     <a:graphicFrameLocks noChangeAspect="1"/>
@@ -1621,7 +1623,7 @@
                         <pic:spPr>
                           <a:xfrm>
                             <a:off x="0" y="0"/>
-                            <a:ext cx="1080000" cy="503339"/>
+                            <a:ext cx="1800000" cy="838898"/>
                           </a:xfrm>
                           <a:prstGeom prst="rect"/>
                         </pic:spPr>

</xml_diff>